<commit_message>
docs(entregables): sincronizar vigencia de sesion y estado de TC-46 en capitulo y matriz
</commit_message>
<xml_diff>
--- a/docs/entregables/Capitulo_Analisis_y_Diseno_BORRADOR.docx
+++ b/docs/entregables/Capitulo_Analisis_y_Diseno_BORRADOR.docx
@@ -2200,7 +2200,7 @@
               <w:rPr>
                 <w:sz w:val="18"/>
               </w:rPr>
-              <w:t xml:space="preserve">bcrypt, RUT fuera de registros; el token de sesión no se revoca al cerrar sesión (8 horas)</w:t>
+              <w:t xml:space="preserve">bcrypt, RUT fuera de registros; vigencia de sesión acortada y configurable (30 min por defecto); token_version planificada</w:t>
             </w:r>
           </w:p>
         </w:tc>
@@ -19698,7 +19698,7 @@
         <w:t xml:space="preserve"> </w:t>
       </w:r>
       <w:r>
-        <w:t xml:space="preserve">indica que la cookie de sesión copiada antes de cerrar sesión sigue siendo válida hasta que expira (8 horas), porque el token no se revoca en el servidor. El requisito RF-03 se cumple en el navegador, pero conviene acortar la vigencia o agregar revocación. La medición de rendimiento (p95 de 6 ms en 30 envíos y 20 envíos simultáneos sin errores) es una referencia local y no reemplaza una prueba de carga en un entorno parecido a producción.</w:t>
+        <w:t xml:space="preserve">indicó originalmente que la cookie previa seguía siendo válida hasta expirar. Como mitigación, la vigencia se redujo y parametrizó con SESSION_TTL_MINUTES (30 min por defecto), con manejo 401 en frontend. La revocación con token_version quedó planificada (T14). La medición de rendimiento (p95 de 6 ms en 30 envíos y 20 envíos simultáneos sin errores) es una referencia local y no reemplaza una prueba de carga en un entorno parecido a producción.</w:t>
       </w:r>
     </w:p>
     <w:bookmarkEnd w:id="79"/>

</xml_diff>